<commit_message>
sync: latest 6-agent pipeline (Agent 5 Physio + Agent 6 CV) + 04.06 clinical updates
- 8-tab bilingual dashboard (EN/RU toggle in header)
- Agent 5: physical rehab (right arm + leg)
- Agent 6: computer vision movement tracker + simulation model
- NIHSS corrected to 12, full medication list, CRP 22.95
- CURE findings banner, brain institute links

Co-Authored-By: Claude Opus 4.8 <noreply@anthropic.com>
</commit_message>
<xml_diff>
--- a/patient_sim/data/medical_history_consolidated_rus.docx
+++ b/patient_sim/data/medical_history_consolidated_rus.docx
@@ -1101,7 +1101,7 @@
                 <w:sz w:val="16"/>
                 <w:szCs w:val="16"/>
               </w:rPr>
-              <w:t xml:space="preserve">Двусторонние атеросклеротические бляшки. Слева — показание к каротидной эндартерэктомии</w:t>
+              <w:t xml:space="preserve">Двусторонние бляшки. Слева стеноз ВСА 75-80% (степень по операции 80%) — показание к КЭА</w:t>
             </w:r>
           </w:p>
         </w:tc>
@@ -3039,7 +3039,7 @@
                 <w:sz w:val="20"/>
                 <w:szCs w:val="20"/>
               </w:rPr>
-              <w:t xml:space="preserve">Динамика NIHSS: пик в остром периоде, минимум 12</w:t>
+              <w:t xml:space="preserve">NIHSS 12 — официально подтверждено эпикризом</w:t>
             </w:r>
           </w:p>
           <w:p>
@@ -3053,7 +3053,7 @@
                 <w:sz w:val="18"/>
                 <w:szCs w:val="18"/>
               </w:rPr>
-              <w:t xml:space="preserve">В остром периоде после операции NIHSS повышался (гиперперфузия + формирование инфаркта), затем устойчиво снижался. Минимально зафиксированное значение — 12 баллов (умеренный инсульт). Несмотря на формальный балл 12, клиническая динамика выраженно положительная: на 4-й день строит предложения, понимание сохранено, нога почти восстановилась. Точная траектория по датам уточняется. NIHSS 12 — умеренный диапазон (5-15).</w:t>
+              <w:t xml:space="preserve">Этапный эпикриз от 03.06.2026 фиксирует: NIHSS 12, ШРМ 5, шкала Рэнкина 5, Ривермид 2. NIHSS 12 — умеренный инсульт (диапазон 5-15). ШРМ 5 квалифицирует пациента на 2-й этап стационарной реабилитации. Несмотря на формальный балл, клиническая динамика выраженно положительная: строит предложения, понимание сохранено, нога почти восстановилась. Прежние значения 7 и 9 были ошибочны и исключены.</w:t>
             </w:r>
           </w:p>
         </w:tc>
@@ -3719,7 +3719,7 @@
           <w:sz w:val="18"/>
           <w:szCs w:val="18"/>
         </w:rPr>
-        <w:t xml:space="preserve">Речь: моторная (Брока) афазия — мямление, отдельные звуки. Сенсорная афазия регрессировала.</w:t>
+        <w:t xml:space="preserve">Речь: комплексная (эфферентная) моторная афазия умеренной степени + кинетическая диспраксия + грубая дизартрия (псевдобульбарная). Понимание сохранено.</w:t>
       </w:r>
     </w:p>
     <w:p>
@@ -3757,7 +3757,7 @@
           <w:sz w:val="18"/>
           <w:szCs w:val="18"/>
         </w:rPr>
-        <w:t xml:space="preserve">Правая рука: сжимает кулак, но парез сохраняется (затронута сильнее ноги)</w:t>
+        <w:t xml:space="preserve">Правосторонний гемипарез: рука 4 балла, нога 4 балла (по эпикризу). Тонус повышен, рефлекс Бабинского справа, гемигипестезия справа.</w:t>
       </w:r>
     </w:p>
     <w:p>
@@ -4475,7 +4475,7 @@
           <w:sz w:val="18"/>
           <w:szCs w:val="18"/>
         </w:rPr>
-        <w:t xml:space="preserve">Оформлено направление на медико-социальную экспертизу (протокол ВК № 88 от 01.06.2026), МСЭ заочно, на дому. Основное заболевание в направлении — атеросклероз артерий нижних конечностей (I70.2); сопутствующие — ЦВБ/ДЭП 2 ст. со стенозом ВСА слева до 70% (I67.8) и последствия перелома шейки бедра с эндопротезом ТБС (T93.1).</w:t>
+        <w:t xml:space="preserve">Оформлено направление на медико-социальную экспертизу (протокол ВК № 88 от 01.06.2026), МСЭ заочно, на дому. Основное заболевание в направлении — атеросклероз артерий нижних конечностей (I70.2); сопутствующие — ЦВБ/ДЭП 2 ст. со стенозом ВСА слева до 75-80% (I67.8) и последствия перелома шейки бедра с эндопротезом ТБС (T93.1).</w:t>
       </w:r>
     </w:p>
     <w:tbl>
@@ -4627,7 +4627,7 @@
                 <w:sz w:val="20"/>
                 <w:szCs w:val="20"/>
               </w:rPr>
-              <w:t xml:space="preserve">КТ без геморрагии открывает путь к антикоагуляции</w:t>
+              <w:t xml:space="preserve">Антикоагуляция НАЧАТА (по эпикризу)</w:t>
             </w:r>
           </w:p>
           <w:p>
@@ -4641,7 +4641,7 @@
                 <w:sz w:val="18"/>
                 <w:szCs w:val="18"/>
               </w:rPr>
-              <w:t xml:space="preserve">Отсутствие геморрагической трансформации при малом инфаркте (ASPECTS 8) снимает основное препятствие для начала антикоагуляции по поводу ФП. Ориентир по правилу «1-3-6-12» и данным ELAN/CATALYST: при малом-умеренном инфаркте начало возможно рано (≈3-4 день), если коагулограмма нормализовалась и нет признаков кровоточивости. Решение — за командой; данные получены на нехирургических пациентах, для случая после КЭА это обоснованная экстраполяция.</w:t>
+              <w:t xml:space="preserve">По этапному эпикризу с 30.05.2026 назначен эноксапарин натрия 8000 анти-Ха МЕ п/к 2 раза в сутки (антикоагулянтная цель), плюс аспирин 125 мг, аторвастатин 20 мг, бисопролол 5 мг, валсартан 40 мг, амлодипин 5 мг, омепразол. Отсутствие геморрагической трансформации (ASPECTS 8) и полученная коагулограмма (МНО ~2,08) позволили начать терапию. Дальнейший переход на пероральный антикоагулянт — по решению команды.</w:t>
             </w:r>
           </w:p>
         </w:tc>
@@ -5176,7 +5176,7 @@
                 <w:sz w:val="16"/>
                 <w:szCs w:val="16"/>
               </w:rPr>
-              <w:t xml:space="preserve">Снижение в динамике</w:t>
+              <w:t xml:space="preserve">Норма</w:t>
             </w:r>
           </w:p>
         </w:tc>
@@ -5211,7 +5211,7 @@
                 <w:sz w:val="16"/>
                 <w:szCs w:val="16"/>
               </w:rPr>
-              <w:t xml:space="preserve">Контроль воспаления (был 14,6)</w:t>
+              <w:t xml:space="preserve">Воспаление РАЗРЕШИЛОСЬ: 14,6 → 1,83 мг/л (норма). Контроль в динамике</w:t>
             </w:r>
           </w:p>
         </w:tc>
@@ -5425,7 +5425,7 @@
                 <w:sz w:val="16"/>
                 <w:szCs w:val="16"/>
               </w:rPr>
-              <w:t xml:space="preserve">Профилактика аспирационной пневмонии</w:t>
+              <w:t xml:space="preserve">Профилактика аспирации. Белок 1,2-1,5 г/кг (при 70 кг = 84-105 г/сут)</w:t>
             </w:r>
           </w:p>
         </w:tc>

</xml_diff>